<commit_message>
fix(submission): retract the paradigm_type silent-failure claim after running Ianvs
Installed the framework (requirements.txt plus the bundled sedna wheel) and ran the
CLI at 37a9c60. Core does validate paradigm_type: algorithm.py:140-143 raises
ValueError and lists the valid values, called from _parse_config at line 167 well
before the dispatch chain I had been reading. The claim that it fails silently is
retracted in the Bonus, Task 3, Task 4 and PR #617 comments, each under a labelled
correction rather than a silent edit.

What survives is narrower and better evidenced: Core validates these identifiers
correctly and CI does not, so both yaoba Examples pass every check the project runs
and fail the moment they execute. They also fail earlier still, at dataset
preparation.

Task 2's Reproduce section now carries this real install and CLI run in place of
its previous statement that no end-to-end run was claimed.

Refs: kubeedge/ianvs#617
</commit_message>
<xml_diff>
--- a/submission/LFX-2026-Term3-Ianvs-Pretest-henryng15.docx
+++ b/submission/LFX-2026-Term3-Ianvs-Pretest-henryng15.docx
@@ -268,6 +268,20 @@
       </w:r>
       <w:r>
         <w:t xml:space="preserve"> https://github.com/kubeedge/ianvs/pull/617#pullrequestreview-5047339798</w:t>
+      </w:r>
+    </w:p>
+    <w:p>
+      <w:pPr>
+        <w:pStyle w:val="ListBullet"/>
+      </w:pPr>
+      <w:r>
+        <w:rPr>
+          <w:b/>
+        </w:rPr>
+        <w:t>Bonus #617 (correction):</w:t>
+      </w:r>
+      <w:r>
+        <w:t xml:space="preserve"> https://github.com/kubeedge/ianvs/pull/617#pullrequestreview-5047393734</w:t>
       </w:r>
     </w:p>
     <w:p>
@@ -9806,25 +9820,162 @@
         <w:rPr>
           <w:b/>
         </w:rPr>
+        <w:t>Also executed — a real Ianvs install and CLI run (added 2026-08-28).</w:t>
+      </w:r>
+      <w:r>
+        <w:t xml:space="preserve"> I installed the</w:t>
+      </w:r>
+    </w:p>
+    <w:p>
+      <w:r>
+        <w:t>framework (</w:t>
+      </w:r>
+      <w:r>
+        <w:rPr>
+          <w:rFonts w:ascii="Consolas" w:hAnsi="Consolas"/>
+          <w:sz w:val="18"/>
+        </w:rPr>
+        <w:t>pip install -r requirements.txt</w:t>
+      </w:r>
+      <w:r>
+        <w:t xml:space="preserve"> plus the bundled </w:t>
+      </w:r>
+      <w:r>
+        <w:rPr>
+          <w:rFonts w:ascii="Consolas" w:hAnsi="Consolas"/>
+          <w:sz w:val="18"/>
+        </w:rPr>
+        <w:t>sedna-0.6.0.1</w:t>
+      </w:r>
+      <w:r>
+        <w:t xml:space="preserve"> wheel) and</w:t>
+      </w:r>
+    </w:p>
+    <w:p>
+      <w:r>
+        <w:t xml:space="preserve">ran the CLI at </w:t>
+      </w:r>
+      <w:r>
+        <w:rPr>
+          <w:rFonts w:ascii="Consolas" w:hAnsi="Consolas"/>
+          <w:sz w:val="18"/>
+        </w:rPr>
+        <w:t>37a9c60</w:t>
+      </w:r>
+      <w:r>
+        <w:t>:</w:t>
+      </w:r>
+    </w:p>
+    <w:p>
+      <w:pPr>
+        <w:spacing w:after="160"/>
+        <w:ind w:left="360"/>
+      </w:pPr>
+      <w:r>
+        <w:rPr>
+          <w:rFonts w:ascii="Consolas" w:hAnsi="Consolas"/>
+          <w:color w:val="223344"/>
+          <w:sz w:val="17"/>
+        </w:rPr>
+        <w:t>$ python benchmarking.py -f examples/yaoba/singletask_learning_boost/benchmarkingjob.yaml</w:t>
+        <w:br/>
+        <w:t>exit code: 1</w:t>
+        <w:br/>
+        <w:t>RuntimeError: benchmarkingjob runs failed, error: prepare dataset failed,</w:t>
+        <w:br/>
+        <w:t>error: not one of train_index/train_data/train_data_info..</w:t>
+        <w:br/>
+        <w:br/>
+        <w:t>$ Algorithm(name=..., config=yaml2dict(".../yaoba/singletask_learning_boost/testalgorithms/algorithm.yaml"))</w:t>
+        <w:br/>
+        <w:t>ValueError: not support paradigm(singletasklearning_acboost).</w:t>
+        <w:br/>
+        <w:t xml:space="preserve">  the following paradigms can be selected: ['singletasklearning', 'incrementallearning', ...]</w:t>
+      </w:r>
+    </w:p>
+    <w:p>
+      <w:r>
+        <w:t xml:space="preserve">Reproduce: </w:t>
+      </w:r>
+      <w:r>
+        <w:rPr>
+          <w:rFonts w:ascii="Consolas" w:hAnsi="Consolas"/>
+          <w:sz w:val="18"/>
+        </w:rPr>
+        <w:t>python3 tools/probe_paradigm_runtime.py ianvs</w:t>
+      </w:r>
+      <w:r>
+        <w:t>.</w:t>
+      </w:r>
+    </w:p>
+    <w:p>
+      <w:r>
+        <w:t xml:space="preserve">This run corrected a claim I had made from static reading — Core validates </w:t>
+      </w:r>
+      <w:r>
+        <w:rPr>
+          <w:rFonts w:ascii="Consolas" w:hAnsi="Consolas"/>
+          <w:sz w:val="18"/>
+        </w:rPr>
+        <w:t>paradigm_type</w:t>
+      </w:r>
+    </w:p>
+    <w:p>
+      <w:r>
+        <w:t>loudly rather than silently — and the correction is recorded in the Bonus, Task 3 and Task</w:t>
+      </w:r>
+    </w:p>
+    <w:p>
+      <w:r>
+        <w:t xml:space="preserve">4 comments rather than quietly edited away. It also establishes that the two </w:t>
+      </w:r>
+      <w:r>
+        <w:rPr>
+          <w:rFonts w:ascii="Consolas" w:hAnsi="Consolas"/>
+          <w:sz w:val="18"/>
+        </w:rPr>
+        <w:t>yaoba</w:t>
+      </w:r>
+    </w:p>
+    <w:p>
+      <w:r>
+        <w:t xml:space="preserve">Examples fail at two independent points, and that the CI validator on </w:t>
+      </w:r>
+      <w:r>
+        <w:rPr>
+          <w:rFonts w:ascii="Consolas" w:hAnsi="Consolas"/>
+          <w:sz w:val="18"/>
+        </w:rPr>
+        <w:t>main</w:t>
+      </w:r>
+      <w:r>
+        <w:t xml:space="preserve"> passes them</w:t>
+      </w:r>
+    </w:p>
+    <w:p>
+      <w:r>
+        <w:t>both regardless.</w:t>
+      </w:r>
+    </w:p>
+    <w:p>
+      <w:r>
+        <w:rPr>
+          <w:b/>
+        </w:rPr>
         <w:t>Not executed, and why.</w:t>
       </w:r>
       <w:r>
-        <w:t xml:space="preserve"> No end-to-end </w:t>
-      </w:r>
-      <w:r>
-        <w:rPr>
-          <w:rFonts w:ascii="Consolas" w:hAnsi="Consolas"/>
-          <w:sz w:val="18"/>
-        </w:rPr>
-        <w:t>ianvs -f benchmarkingjob.yaml</w:t>
-      </w:r>
-      <w:r>
-        <w:t xml:space="preserve"> run is claimed</w:t>
-      </w:r>
-    </w:p>
-    <w:p>
-      <w:r>
-        <w:t>for any affected Example. Concretely:</w:t>
+        <w:t xml:space="preserve"> No end-to-end benchmark *result* is claimed for any affected</w:t>
+      </w:r>
+    </w:p>
+    <w:p>
+      <w:r>
+        <w:t>Example — every run above terminates at a configuration or dataset error rather than</w:t>
+      </w:r>
+    </w:p>
+    <w:p>
+      <w:r>
+        <w:t>producing a leaderboard. Concretely:</w:t>
       </w:r>
     </w:p>
     <w:tbl>
@@ -15925,29 +16076,68 @@
     </w:p>
     <w:p>
       <w:r>
-        <w:t xml:space="preserve">runs while being unable to execute at all.** Dispatch in </w:t>
-      </w:r>
-      <w:r>
-        <w:rPr>
-          <w:rFonts w:ascii="Consolas" w:hAnsi="Consolas"/>
-          <w:sz w:val="18"/>
-        </w:rPr>
-        <w:t>base.py:95-152</w:t>
-      </w:r>
-      <w:r>
-        <w:t xml:space="preserve"> and</w:t>
-      </w:r>
-    </w:p>
-    <w:p>
-      <w:r>
-        <w:rPr>
-          <w:rFonts w:ascii="Consolas" w:hAnsi="Consolas"/>
-          <w:sz w:val="18"/>
-        </w:rPr>
-        <w:t>algorithm.py:109-127</w:t>
-      </w:r>
-      <w:r>
-        <w:t xml:space="preserve"> has no </w:t>
+        <w:t>runs while being unable to execute at all.** Core itself raises on this (</w:t>
+      </w:r>
+      <w:r>
+        <w:rPr>
+          <w:rFonts w:ascii="Consolas" w:hAnsi="Consolas"/>
+          <w:sz w:val="18"/>
+        </w:rPr>
+        <w:t>algorithm.py:140-143</w:t>
+      </w:r>
+      <w:r>
+        <w:t>); see the second correction below.</w:t>
+      </w:r>
+    </w:p>
+    <w:p>
+      <w:r>
+        <w:t>So the revised boundary claim is narrower and stands on executed evidence: **Core should</w:t>
+      </w:r>
+    </w:p>
+    <w:p>
+      <w:r>
+        <w:t>expose what it *would* resolve — the registration keys and the paradigm dispatch table —</w:t>
+      </w:r>
+    </w:p>
+    <w:p>
+      <w:r>
+        <w:t>so the existing validator can check identifiers as well as paths.** That is Step 1 of §3.4</w:t>
+      </w:r>
+    </w:p>
+    <w:p>
+      <w:r>
+        <w:t>unchanged; only Step 2's framing was wrong.</w:t>
+      </w:r>
+    </w:p>
+    <w:p>
+      <w:pPr>
+        <w:jc w:val="center"/>
+      </w:pPr>
+      <w:r>
+        <w:t>______________________________________________________________________________</w:t>
+      </w:r>
+    </w:p>
+    <w:p>
+      <w:pPr>
+        <w:pStyle w:val="Heading2"/>
+      </w:pPr>
+      <w:r>
+        <w:t>Second correction — posted 2026-08-28, after installing Ianvs and running it</w:t>
+      </w:r>
+    </w:p>
+    <w:p>
+      <w:r>
+        <w:t>**I got the mechanism wrong in the update above, and I am fixing it with an executed run</w:t>
+      </w:r>
+    </w:p>
+    <w:p>
+      <w:r>
+        <w:t>rather than another static reading.**</w:t>
+      </w:r>
+    </w:p>
+    <w:p>
+      <w:r>
+        <w:t xml:space="preserve">I wrote that dispatch "has no </w:t>
       </w:r>
       <w:r>
         <w:rPr>
@@ -15957,7 +16147,40 @@
         <w:t>else</w:t>
       </w:r>
       <w:r>
-        <w:t xml:space="preserve">, so an unknown </w:t>
+        <w:t xml:space="preserve">, so the call returns </w:t>
+      </w:r>
+      <w:r>
+        <w:rPr>
+          <w:rFonts w:ascii="Consolas" w:hAnsi="Consolas"/>
+          <w:sz w:val="18"/>
+        </w:rPr>
+        <w:t>None</w:t>
+      </w:r>
+      <w:r>
+        <w:t xml:space="preserve"> — no exception, no log</w:t>
+      </w:r>
+    </w:p>
+    <w:p>
+      <w:r>
+        <w:t xml:space="preserve">line, no validation at config-parse time." </w:t>
+      </w:r>
+      <w:r>
+        <w:rPr>
+          <w:b/>
+        </w:rPr>
+        <w:t>That is false.</w:t>
+      </w:r>
+    </w:p>
+    <w:p>
+      <w:r>
+        <w:rPr>
+          <w:rFonts w:ascii="Consolas" w:hAnsi="Consolas"/>
+          <w:sz w:val="18"/>
+        </w:rPr>
+        <w:t>core/testcasecontroller/algorithm/algorithm.py:140-143</w:t>
+      </w:r>
+      <w:r>
+        <w:t xml:space="preserve"> validates </w:t>
       </w:r>
       <w:r>
         <w:rPr>
@@ -15967,39 +16190,532 @@
         <w:t>paradigm_type</w:t>
       </w:r>
       <w:r>
-        <w:t xml:space="preserve"> returns </w:t>
-      </w:r>
-      <w:r>
-        <w:rPr>
-          <w:rFonts w:ascii="Consolas" w:hAnsi="Consolas"/>
-          <w:sz w:val="18"/>
-        </w:rPr>
-        <w:t>None</w:t>
-      </w:r>
-    </w:p>
-    <w:p>
-      <w:r>
-        <w:t>silently.</w:t>
-      </w:r>
-    </w:p>
-    <w:p>
-      <w:r>
-        <w:t>So the revised boundary claim is narrower and stands on executed evidence: **Core should</w:t>
-      </w:r>
-    </w:p>
-    <w:p>
-      <w:r>
-        <w:t>expose what it *would* resolve — the registration keys and the paradigm dispatch table —</w:t>
-      </w:r>
-    </w:p>
-    <w:p>
-      <w:r>
-        <w:t>so the existing validator can check identifiers as well as paths.** That is Step 1 of §3.4</w:t>
-      </w:r>
-    </w:p>
-    <w:p>
-      <w:r>
-        <w:t>unchanged; only Step 2's framing was wrong.</w:t>
+        <w:t xml:space="preserve"> against</w:t>
+      </w:r>
+    </w:p>
+    <w:p>
+      <w:r>
+        <w:t xml:space="preserve">the enum and raises. It is called from </w:t>
+      </w:r>
+      <w:r>
+        <w:rPr>
+          <w:rFonts w:ascii="Consolas" w:hAnsi="Consolas"/>
+          <w:sz w:val="18"/>
+        </w:rPr>
+        <w:t>_parse_config</w:t>
+      </w:r>
+      <w:r>
+        <w:t xml:space="preserve"> at line 167, long before the</w:t>
+      </w:r>
+    </w:p>
+    <w:p>
+      <w:r>
+        <w:t>dispatch chain I was reading is reached.</w:t>
+      </w:r>
+    </w:p>
+    <w:p>
+      <w:r>
+        <w:t>Installed Ianvs (</w:t>
+      </w:r>
+      <w:r>
+        <w:rPr>
+          <w:rFonts w:ascii="Consolas" w:hAnsi="Consolas"/>
+          <w:sz w:val="18"/>
+        </w:rPr>
+        <w:t>pip install -r requirements.txt</w:t>
+      </w:r>
+      <w:r>
+        <w:t xml:space="preserve"> plus the bundled</w:t>
+      </w:r>
+    </w:p>
+    <w:p>
+      <w:r>
+        <w:rPr>
+          <w:rFonts w:ascii="Consolas" w:hAnsi="Consolas"/>
+          <w:sz w:val="18"/>
+        </w:rPr>
+        <w:t>sedna-0.6.0.1</w:t>
+      </w:r>
+      <w:r>
+        <w:t xml:space="preserve"> wheel) and ran it:</w:t>
+      </w:r>
+    </w:p>
+    <w:p>
+      <w:pPr>
+        <w:spacing w:after="160"/>
+        <w:ind w:left="360"/>
+      </w:pPr>
+      <w:r>
+        <w:rPr>
+          <w:rFonts w:ascii="Consolas" w:hAnsi="Consolas"/>
+          <w:color w:val="223344"/>
+          <w:sz w:val="17"/>
+        </w:rPr>
+        <w:t>ianvs commit under test: 37a9c60</w:t>
+        <w:br/>
+        <w:br/>
+        <w:t>1. ianvs CLI on examples/yaoba/singletask_learning_boost</w:t>
+        <w:br/>
+        <w:t xml:space="preserve">   exit code: 1</w:t>
+        <w:br/>
+        <w:t xml:space="preserve">   RuntimeError: benchmarkingjob runs failed, error: prepare dataset failed,</w:t>
+        <w:br/>
+        <w:t xml:space="preserve">   error: not one of train_index/train_data/train_data_info..</w:t>
+        <w:br/>
+        <w:br/>
+        <w:t>2. Algorithm(...) -- where paradigm_type is validated</w:t>
+        <w:br/>
+        <w:t xml:space="preserve">   yaoba acboost: paradigm_type='singletasklearning_acboost'</w:t>
+        <w:br/>
+        <w:t xml:space="preserve">      -&gt; ValueError: not support paradigm(singletasklearning_acboost).</w:t>
+        <w:br/>
+        <w:t xml:space="preserve">         the following paradigms can be selected: ['singletasklearning', ...]</w:t>
+        <w:br/>
+        <w:t xml:space="preserve">   yaoba tta:     paradigm_type='singletasklearning_tta'</w:t>
+        <w:br/>
+        <w:t xml:space="preserve">      -&gt; ValueError: not support paradigm(singletasklearning_tta). ...</w:t>
+        <w:br/>
+        <w:t xml:space="preserve">   valid control: paradigm_type='singletasklearning'</w:t>
+        <w:br/>
+        <w:t xml:space="preserve">      -&gt; constructed, no error</w:t>
+      </w:r>
+    </w:p>
+    <w:p>
+      <w:r>
+        <w:t xml:space="preserve">Reproduce: </w:t>
+      </w:r>
+      <w:r>
+        <w:rPr>
+          <w:rFonts w:ascii="Consolas" w:hAnsi="Consolas"/>
+          <w:sz w:val="18"/>
+        </w:rPr>
+        <w:t>python3 tools/probe_paradigm_runtime.py ianvs</w:t>
+      </w:r>
+      <w:r>
+        <w:t>.</w:t>
+      </w:r>
+    </w:p>
+    <w:p>
+      <w:r>
+        <w:rPr>
+          <w:b/>
+        </w:rPr>
+        <w:t>Corrected statement of the finding.</w:t>
+      </w:r>
+      <w:r>
+        <w:t xml:space="preserve"> Two things I claimed are confirmed, one is retracted:</w:t>
+      </w:r>
+    </w:p>
+    <w:tbl>
+      <w:tblPr>
+        <w:tblStyle w:val="LightGrid-Accent1"/>
+        <w:tblW w:type="auto" w:w="0"/>
+        <w:tblLook w:firstColumn="1" w:firstRow="1" w:lastColumn="0" w:lastRow="0" w:noHBand="0" w:noVBand="1" w:val="04A0"/>
+      </w:tblPr>
+      <w:tblGrid>
+        <w:gridCol w:w="4320"/>
+        <w:gridCol w:w="4320"/>
+      </w:tblGrid>
+      <w:tr>
+        <w:tc>
+          <w:tcPr>
+            <w:tcW w:type="dxa" w:w="4320"/>
+          </w:tcPr>
+          <w:p>
+            <w:pPr>
+              <w:spacing w:after="40"/>
+            </w:pPr>
+            <w:r>
+              <w:rPr>
+                <w:b/>
+                <w:sz w:val="17"/>
+              </w:rPr>
+            </w:r>
+            <w:r>
+              <w:rPr>
+                <w:b/>
+                <w:sz w:val="17"/>
+              </w:rPr>
+              <w:t>Claim</w:t>
+            </w:r>
+          </w:p>
+        </w:tc>
+        <w:tc>
+          <w:tcPr>
+            <w:tcW w:type="dxa" w:w="4320"/>
+          </w:tcPr>
+          <w:p>
+            <w:pPr>
+              <w:spacing w:after="40"/>
+            </w:pPr>
+            <w:r>
+              <w:rPr>
+                <w:b/>
+                <w:sz w:val="17"/>
+              </w:rPr>
+            </w:r>
+            <w:r>
+              <w:rPr>
+                <w:b/>
+                <w:sz w:val="17"/>
+              </w:rPr>
+              <w:t>Verdict</w:t>
+            </w:r>
+          </w:p>
+        </w:tc>
+      </w:tr>
+      <w:tr>
+        <w:tc>
+          <w:tcPr>
+            <w:tcW w:type="dxa" w:w="4320"/>
+          </w:tcPr>
+          <w:p>
+            <w:pPr>
+              <w:spacing w:after="40"/>
+            </w:pPr>
+            <w:r>
+              <w:rPr>
+                <w:sz w:val="17"/>
+              </w:rPr>
+            </w:r>
+            <w:r>
+              <w:rPr>
+                <w:sz w:val="17"/>
+              </w:rPr>
+              <w:t xml:space="preserve">Both </w:t>
+            </w:r>
+            <w:r>
+              <w:rPr>
+                <w:rFonts w:ascii="Consolas" w:hAnsi="Consolas"/>
+                <w:sz w:val="17"/>
+              </w:rPr>
+              <w:t>yaoba</w:t>
+            </w:r>
+            <w:r>
+              <w:rPr>
+                <w:sz w:val="17"/>
+              </w:rPr>
+              <w:t xml:space="preserve"> Examples are unrunnable</w:t>
+            </w:r>
+          </w:p>
+        </w:tc>
+        <w:tc>
+          <w:tcPr>
+            <w:tcW w:type="dxa" w:w="4320"/>
+          </w:tcPr>
+          <w:p>
+            <w:pPr>
+              <w:spacing w:after="40"/>
+            </w:pPr>
+            <w:r>
+              <w:rPr>
+                <w:sz w:val="17"/>
+              </w:rPr>
+            </w:r>
+            <w:r>
+              <w:rPr>
+                <w:b/>
+                <w:sz w:val="17"/>
+              </w:rPr>
+              <w:t>confirmed</w:t>
+            </w:r>
+            <w:r>
+              <w:rPr>
+                <w:sz w:val="17"/>
+              </w:rPr>
+              <w:t xml:space="preserve"> — the CLI exits 1, and </w:t>
+            </w:r>
+            <w:r>
+              <w:rPr>
+                <w:rFonts w:ascii="Consolas" w:hAnsi="Consolas"/>
+                <w:sz w:val="17"/>
+              </w:rPr>
+              <w:t>Algorithm(...)</w:t>
+            </w:r>
+            <w:r>
+              <w:rPr>
+                <w:sz w:val="17"/>
+              </w:rPr>
+              <w:t xml:space="preserve"> raises on the paradigm</w:t>
+            </w:r>
+          </w:p>
+        </w:tc>
+      </w:tr>
+      <w:tr>
+        <w:tc>
+          <w:tcPr>
+            <w:tcW w:type="dxa" w:w="4320"/>
+          </w:tcPr>
+          <w:p>
+            <w:pPr>
+              <w:spacing w:after="40"/>
+            </w:pPr>
+            <w:r>
+              <w:rPr>
+                <w:sz w:val="17"/>
+              </w:rPr>
+            </w:r>
+            <w:r>
+              <w:rPr>
+                <w:sz w:val="17"/>
+              </w:rPr>
+              <w:t xml:space="preserve">The shipped CI validator reports </w:t>
+            </w:r>
+            <w:r>
+              <w:rPr>
+                <w:b/>
+                <w:sz w:val="17"/>
+              </w:rPr>
+              <w:t>PASS</w:t>
+            </w:r>
+            <w:r>
+              <w:rPr>
+                <w:sz w:val="17"/>
+              </w:rPr>
+              <w:t xml:space="preserve"> for both</w:t>
+            </w:r>
+          </w:p>
+        </w:tc>
+        <w:tc>
+          <w:tcPr>
+            <w:tcW w:type="dxa" w:w="4320"/>
+          </w:tcPr>
+          <w:p>
+            <w:pPr>
+              <w:spacing w:after="40"/>
+            </w:pPr>
+            <w:r>
+              <w:rPr>
+                <w:sz w:val="17"/>
+              </w:rPr>
+            </w:r>
+            <w:r>
+              <w:rPr>
+                <w:b/>
+                <w:sz w:val="17"/>
+              </w:rPr>
+              <w:t>confirmed</w:t>
+            </w:r>
+          </w:p>
+        </w:tc>
+      </w:tr>
+      <w:tr>
+        <w:tc>
+          <w:tcPr>
+            <w:tcW w:type="dxa" w:w="4320"/>
+          </w:tcPr>
+          <w:p>
+            <w:pPr>
+              <w:spacing w:after="40"/>
+            </w:pPr>
+            <w:r>
+              <w:rPr>
+                <w:sz w:val="17"/>
+              </w:rPr>
+            </w:r>
+            <w:r>
+              <w:rPr>
+                <w:sz w:val="17"/>
+              </w:rPr>
+              <w:t xml:space="preserve">Core validates </w:t>
+            </w:r>
+            <w:r>
+              <w:rPr>
+                <w:rFonts w:ascii="Consolas" w:hAnsi="Consolas"/>
+                <w:sz w:val="17"/>
+              </w:rPr>
+              <w:t>paradigm_type</w:t>
+            </w:r>
+            <w:r>
+              <w:rPr>
+                <w:sz w:val="17"/>
+              </w:rPr>
+              <w:t xml:space="preserve"> silently / returns </w:t>
+            </w:r>
+            <w:r>
+              <w:rPr>
+                <w:rFonts w:ascii="Consolas" w:hAnsi="Consolas"/>
+                <w:sz w:val="17"/>
+              </w:rPr>
+              <w:t>None</w:t>
+            </w:r>
+          </w:p>
+        </w:tc>
+        <w:tc>
+          <w:tcPr>
+            <w:tcW w:type="dxa" w:w="4320"/>
+          </w:tcPr>
+          <w:p>
+            <w:pPr>
+              <w:spacing w:after="40"/>
+            </w:pPr>
+            <w:r>
+              <w:rPr>
+                <w:sz w:val="17"/>
+              </w:rPr>
+            </w:r>
+            <w:r>
+              <w:rPr>
+                <w:b/>
+                <w:sz w:val="17"/>
+              </w:rPr>
+              <w:t>RETRACTED — Core validates it correctly and loudly</w:t>
+            </w:r>
+          </w:p>
+        </w:tc>
+      </w:tr>
+    </w:tbl>
+    <w:p/>
+    <w:p>
+      <w:r>
+        <w:t>The run also shows the Examples fail *even earlier* than the paradigm check, at dataset</w:t>
+      </w:r>
+    </w:p>
+    <w:p>
+      <w:r>
+        <w:t>preparation (</w:t>
+      </w:r>
+      <w:r>
+        <w:rPr>
+          <w:rFonts w:ascii="Consolas" w:hAnsi="Consolas"/>
+          <w:sz w:val="18"/>
+        </w:rPr>
+        <w:t>not one of train_index/train_data/train_data_info</w:t>
+      </w:r>
+      <w:r>
+        <w:t>), so they are broken in at</w:t>
+      </w:r>
+    </w:p>
+    <w:p>
+      <w:r>
+        <w:t>least two independent ways.</w:t>
+      </w:r>
+    </w:p>
+    <w:p>
+      <w:r>
+        <w:rPr>
+          <w:b/>
+        </w:rPr>
+        <w:t>What the finding actually is, now that it is measured.</w:t>
+      </w:r>
+      <w:r>
+        <w:t xml:space="preserve"> The gap is not that Ianvs fails</w:t>
+      </w:r>
+    </w:p>
+    <w:p>
+      <w:r>
+        <w:t>to validate identifiers — Core validates them, with a good error message that even lists</w:t>
+      </w:r>
+    </w:p>
+    <w:p>
+      <w:r>
+        <w:t>the valid values. The gap is that **CI and Core validate different things, and CI's set is</w:t>
+      </w:r>
+    </w:p>
+    <w:p>
+      <w:r>
+        <w:t xml:space="preserve">the smaller one.** </w:t>
+      </w:r>
+      <w:r>
+        <w:rPr>
+          <w:rFonts w:ascii="Consolas" w:hAnsi="Consolas"/>
+          <w:sz w:val="18"/>
+        </w:rPr>
+        <w:t>ParadigmType</w:t>
+      </w:r>
+      <w:r>
+        <w:t xml:space="preserve"> is right there in </w:t>
+      </w:r>
+      <w:r>
+        <w:rPr>
+          <w:rFonts w:ascii="Consolas" w:hAnsi="Consolas"/>
+          <w:sz w:val="18"/>
+        </w:rPr>
+        <w:t>core/common/constant.py</w:t>
+      </w:r>
+      <w:r>
+        <w:t>; the</w:t>
+      </w:r>
+    </w:p>
+    <w:p>
+      <w:r>
+        <w:t xml:space="preserve">validator under </w:t>
+      </w:r>
+      <w:r>
+        <w:rPr>
+          <w:rFonts w:ascii="Consolas" w:hAnsi="Consolas"/>
+          <w:sz w:val="18"/>
+        </w:rPr>
+        <w:t>.github/workflows/validator/</w:t>
+      </w:r>
+      <w:r>
+        <w:t xml:space="preserve"> never consults it, so two Examples pass</w:t>
+      </w:r>
+    </w:p>
+    <w:p>
+      <w:r>
+        <w:t>every check the project runs and fail immediately when actually executed.</w:t>
+      </w:r>
+    </w:p>
+    <w:p>
+      <w:r>
+        <w:t>That is a narrower claim than the one I published, and it is a better one: it names the</w:t>
+      </w:r>
+    </w:p>
+    <w:p>
+      <w:r>
+        <w:t>information that already exists in the tree and is simply not wired into the check. It is</w:t>
+      </w:r>
+    </w:p>
+    <w:p>
+      <w:r>
+        <w:t>also exactly Step 1 of my Task 3 repair strategy — have Core expose what it would resolve,</w:t>
+      </w:r>
+    </w:p>
+    <w:p>
+      <w:r>
+        <w:t>so the existing validator can consult it — which I can now say is a small change rather</w:t>
+      </w:r>
+    </w:p>
+    <w:p>
+      <w:r>
+        <w:t>than a new subsystem.</w:t>
+      </w:r>
+    </w:p>
+    <w:p>
+      <w:r>
+        <w:rPr>
+          <w:b/>
+        </w:rPr>
+        <w:t>On my own method, again.</w:t>
+      </w:r>
+      <w:r>
+        <w:t xml:space="preserve"> This is my second correction on this submission. Both came</w:t>
+      </w:r>
+    </w:p>
+    <w:p>
+      <w:r>
+        <w:t>from the same habit: reading a dispatch chain and inferring behaviour instead of running</w:t>
+      </w:r>
+    </w:p>
+    <w:p>
+      <w:r>
+        <w:t>it. The first correction I found by reading someone else's review; this one I found by</w:t>
+      </w:r>
+    </w:p>
+    <w:p>
+      <w:r>
+        <w:t>finally installing the framework. The submission's own thesis is that unvalidated</w:t>
+      </w:r>
+    </w:p>
+    <w:p>
+      <w:r>
+        <w:t>declarations drift until something executes them — which turns out to apply to my</w:t>
+      </w:r>
+    </w:p>
+    <w:p>
+      <w:r>
+        <w:t>analysis as well as to the repository's configs.</w:t>
       </w:r>
     </w:p>
     <w:p>
@@ -23443,6 +24159,228 @@
         <w:t>.github/workflows/validator/</w:t>
       </w:r>
       <w:r>
+        <w:t>. (See the second correction below</w:t>
+      </w:r>
+    </w:p>
+    <w:p>
+      <w:r>
+        <w:t>for what Core itself does check.)</w:t>
+      </w:r>
+    </w:p>
+    <w:p>
+      <w:r>
+        <w:rPr>
+          <w:b/>
+        </w:rPr>
+        <w:t>A note on my own method.</w:t>
+      </w:r>
+      <w:r>
+        <w:t xml:space="preserve"> I built a prior-art map over 86 Discussions and every open</w:t>
+      </w:r>
+    </w:p>
+    <w:p>
+      <w:r>
+        <w:t>target, and still missed a validator sitting in the tree I had checked out. The failure is</w:t>
+      </w:r>
+    </w:p>
+    <w:p>
+      <w:r>
+        <w:t>instructive for this submission's own thesis: I searched for *proposals* in the PR queue</w:t>
+      </w:r>
+    </w:p>
+    <w:p>
+      <w:r>
+        <w:t>and did not check what had already *merged*. Recording it here because a verification</w:t>
+      </w:r>
+    </w:p>
+    <w:p>
+      <w:r>
+        <w:t>boundary is worth nothing if it only covers the checks that happened to be run.</w:t>
+      </w:r>
+    </w:p>
+    <w:p>
+      <w:pPr>
+        <w:jc w:val="center"/>
+      </w:pPr>
+      <w:r>
+        <w:t>______________________________________________________________________________</w:t>
+      </w:r>
+    </w:p>
+    <w:p>
+      <w:pPr>
+        <w:pStyle w:val="Heading2"/>
+      </w:pPr>
+      <w:r>
+        <w:t>Second correction — posted 2026-08-28, after installing Ianvs and running it</w:t>
+      </w:r>
+    </w:p>
+    <w:p>
+      <w:r>
+        <w:t>**I got the mechanism wrong in the update above, and I am fixing it with an executed run</w:t>
+      </w:r>
+    </w:p>
+    <w:p>
+      <w:r>
+        <w:t>rather than another static reading.**</w:t>
+      </w:r>
+    </w:p>
+    <w:p>
+      <w:r>
+        <w:t xml:space="preserve">I wrote that dispatch "has no </w:t>
+      </w:r>
+      <w:r>
+        <w:rPr>
+          <w:rFonts w:ascii="Consolas" w:hAnsi="Consolas"/>
+          <w:sz w:val="18"/>
+        </w:rPr>
+        <w:t>else</w:t>
+      </w:r>
+      <w:r>
+        <w:t xml:space="preserve">, so the call returns </w:t>
+      </w:r>
+      <w:r>
+        <w:rPr>
+          <w:rFonts w:ascii="Consolas" w:hAnsi="Consolas"/>
+          <w:sz w:val="18"/>
+        </w:rPr>
+        <w:t>None</w:t>
+      </w:r>
+      <w:r>
+        <w:t xml:space="preserve"> — no exception, no log</w:t>
+      </w:r>
+    </w:p>
+    <w:p>
+      <w:r>
+        <w:t xml:space="preserve">line, no validation at config-parse time." </w:t>
+      </w:r>
+      <w:r>
+        <w:rPr>
+          <w:b/>
+        </w:rPr>
+        <w:t>That is false.</w:t>
+      </w:r>
+    </w:p>
+    <w:p>
+      <w:r>
+        <w:rPr>
+          <w:rFonts w:ascii="Consolas" w:hAnsi="Consolas"/>
+          <w:sz w:val="18"/>
+        </w:rPr>
+        <w:t>core/testcasecontroller/algorithm/algorithm.py:140-143</w:t>
+      </w:r>
+      <w:r>
+        <w:t xml:space="preserve"> validates </w:t>
+      </w:r>
+      <w:r>
+        <w:rPr>
+          <w:rFonts w:ascii="Consolas" w:hAnsi="Consolas"/>
+          <w:sz w:val="18"/>
+        </w:rPr>
+        <w:t>paradigm_type</w:t>
+      </w:r>
+      <w:r>
+        <w:t xml:space="preserve"> against</w:t>
+      </w:r>
+    </w:p>
+    <w:p>
+      <w:r>
+        <w:t xml:space="preserve">the enum and raises. It is called from </w:t>
+      </w:r>
+      <w:r>
+        <w:rPr>
+          <w:rFonts w:ascii="Consolas" w:hAnsi="Consolas"/>
+          <w:sz w:val="18"/>
+        </w:rPr>
+        <w:t>_parse_config</w:t>
+      </w:r>
+      <w:r>
+        <w:t xml:space="preserve"> at line 167, long before the</w:t>
+      </w:r>
+    </w:p>
+    <w:p>
+      <w:r>
+        <w:t>dispatch chain I was reading is reached.</w:t>
+      </w:r>
+    </w:p>
+    <w:p>
+      <w:r>
+        <w:t>Installed Ianvs (</w:t>
+      </w:r>
+      <w:r>
+        <w:rPr>
+          <w:rFonts w:ascii="Consolas" w:hAnsi="Consolas"/>
+          <w:sz w:val="18"/>
+        </w:rPr>
+        <w:t>pip install -r requirements.txt</w:t>
+      </w:r>
+      <w:r>
+        <w:t xml:space="preserve"> plus the bundled</w:t>
+      </w:r>
+    </w:p>
+    <w:p>
+      <w:r>
+        <w:rPr>
+          <w:rFonts w:ascii="Consolas" w:hAnsi="Consolas"/>
+          <w:sz w:val="18"/>
+        </w:rPr>
+        <w:t>sedna-0.6.0.1</w:t>
+      </w:r>
+      <w:r>
+        <w:t xml:space="preserve"> wheel) and ran it:</w:t>
+      </w:r>
+    </w:p>
+    <w:p>
+      <w:pPr>
+        <w:spacing w:after="160"/>
+        <w:ind w:left="360"/>
+      </w:pPr>
+      <w:r>
+        <w:rPr>
+          <w:rFonts w:ascii="Consolas" w:hAnsi="Consolas"/>
+          <w:color w:val="223344"/>
+          <w:sz w:val="17"/>
+        </w:rPr>
+        <w:t>ianvs commit under test: 37a9c60</w:t>
+        <w:br/>
+        <w:br/>
+        <w:t>1. ianvs CLI on examples/yaoba/singletask_learning_boost</w:t>
+        <w:br/>
+        <w:t xml:space="preserve">   exit code: 1</w:t>
+        <w:br/>
+        <w:t xml:space="preserve">   RuntimeError: benchmarkingjob runs failed, error: prepare dataset failed,</w:t>
+        <w:br/>
+        <w:t xml:space="preserve">   error: not one of train_index/train_data/train_data_info..</w:t>
+        <w:br/>
+        <w:br/>
+        <w:t>2. Algorithm(...) -- where paradigm_type is validated</w:t>
+        <w:br/>
+        <w:t xml:space="preserve">   yaoba acboost: paradigm_type='singletasklearning_acboost'</w:t>
+        <w:br/>
+        <w:t xml:space="preserve">      -&gt; ValueError: not support paradigm(singletasklearning_acboost).</w:t>
+        <w:br/>
+        <w:t xml:space="preserve">         the following paradigms can be selected: ['singletasklearning', ...]</w:t>
+        <w:br/>
+        <w:t xml:space="preserve">   yaoba tta:     paradigm_type='singletasklearning_tta'</w:t>
+        <w:br/>
+        <w:t xml:space="preserve">      -&gt; ValueError: not support paradigm(singletasklearning_tta). ...</w:t>
+        <w:br/>
+        <w:t xml:space="preserve">   valid control: paradigm_type='singletasklearning'</w:t>
+        <w:br/>
+        <w:t xml:space="preserve">      -&gt; constructed, no error</w:t>
+      </w:r>
+    </w:p>
+    <w:p>
+      <w:r>
+        <w:t xml:space="preserve">Reproduce: </w:t>
+      </w:r>
+      <w:r>
+        <w:rPr>
+          <w:rFonts w:ascii="Consolas" w:hAnsi="Consolas"/>
+          <w:sz w:val="18"/>
+        </w:rPr>
+        <w:t>python3 tools/probe_paradigm_runtime.py ianvs</w:t>
+      </w:r>
+      <w:r>
         <w:t>.</w:t>
       </w:r>
     </w:p>
@@ -23451,30 +24389,422 @@
         <w:rPr>
           <w:b/>
         </w:rPr>
-        <w:t>A note on my own method.</w:t>
-      </w:r>
-      <w:r>
-        <w:t xml:space="preserve"> I built a prior-art map over 86 Discussions and every open</w:t>
-      </w:r>
-    </w:p>
-    <w:p>
-      <w:r>
-        <w:t>target, and still missed a validator sitting in the tree I had checked out. The failure is</w:t>
-      </w:r>
-    </w:p>
-    <w:p>
-      <w:r>
-        <w:t>instructive for this submission's own thesis: I searched for *proposals* in the PR queue</w:t>
-      </w:r>
-    </w:p>
-    <w:p>
-      <w:r>
-        <w:t>and did not check what had already *merged*. Recording it here because a verification</w:t>
-      </w:r>
-    </w:p>
-    <w:p>
-      <w:r>
-        <w:t>boundary is worth nothing if it only covers the checks that happened to be run.</w:t>
+        <w:t>Corrected statement of the finding.</w:t>
+      </w:r>
+      <w:r>
+        <w:t xml:space="preserve"> Two things I claimed are confirmed, one is retracted:</w:t>
+      </w:r>
+    </w:p>
+    <w:tbl>
+      <w:tblPr>
+        <w:tblStyle w:val="LightGrid-Accent1"/>
+        <w:tblW w:type="auto" w:w="0"/>
+        <w:tblLook w:firstColumn="1" w:firstRow="1" w:lastColumn="0" w:lastRow="0" w:noHBand="0" w:noVBand="1" w:val="04A0"/>
+      </w:tblPr>
+      <w:tblGrid>
+        <w:gridCol w:w="4320"/>
+        <w:gridCol w:w="4320"/>
+      </w:tblGrid>
+      <w:tr>
+        <w:tc>
+          <w:tcPr>
+            <w:tcW w:type="dxa" w:w="4320"/>
+          </w:tcPr>
+          <w:p>
+            <w:pPr>
+              <w:spacing w:after="40"/>
+            </w:pPr>
+            <w:r>
+              <w:rPr>
+                <w:b/>
+                <w:sz w:val="17"/>
+              </w:rPr>
+            </w:r>
+            <w:r>
+              <w:rPr>
+                <w:b/>
+                <w:sz w:val="17"/>
+              </w:rPr>
+              <w:t>Claim</w:t>
+            </w:r>
+          </w:p>
+        </w:tc>
+        <w:tc>
+          <w:tcPr>
+            <w:tcW w:type="dxa" w:w="4320"/>
+          </w:tcPr>
+          <w:p>
+            <w:pPr>
+              <w:spacing w:after="40"/>
+            </w:pPr>
+            <w:r>
+              <w:rPr>
+                <w:b/>
+                <w:sz w:val="17"/>
+              </w:rPr>
+            </w:r>
+            <w:r>
+              <w:rPr>
+                <w:b/>
+                <w:sz w:val="17"/>
+              </w:rPr>
+              <w:t>Verdict</w:t>
+            </w:r>
+          </w:p>
+        </w:tc>
+      </w:tr>
+      <w:tr>
+        <w:tc>
+          <w:tcPr>
+            <w:tcW w:type="dxa" w:w="4320"/>
+          </w:tcPr>
+          <w:p>
+            <w:pPr>
+              <w:spacing w:after="40"/>
+            </w:pPr>
+            <w:r>
+              <w:rPr>
+                <w:sz w:val="17"/>
+              </w:rPr>
+            </w:r>
+            <w:r>
+              <w:rPr>
+                <w:sz w:val="17"/>
+              </w:rPr>
+              <w:t xml:space="preserve">Both </w:t>
+            </w:r>
+            <w:r>
+              <w:rPr>
+                <w:rFonts w:ascii="Consolas" w:hAnsi="Consolas"/>
+                <w:sz w:val="17"/>
+              </w:rPr>
+              <w:t>yaoba</w:t>
+            </w:r>
+            <w:r>
+              <w:rPr>
+                <w:sz w:val="17"/>
+              </w:rPr>
+              <w:t xml:space="preserve"> Examples are unrunnable</w:t>
+            </w:r>
+          </w:p>
+        </w:tc>
+        <w:tc>
+          <w:tcPr>
+            <w:tcW w:type="dxa" w:w="4320"/>
+          </w:tcPr>
+          <w:p>
+            <w:pPr>
+              <w:spacing w:after="40"/>
+            </w:pPr>
+            <w:r>
+              <w:rPr>
+                <w:sz w:val="17"/>
+              </w:rPr>
+            </w:r>
+            <w:r>
+              <w:rPr>
+                <w:b/>
+                <w:sz w:val="17"/>
+              </w:rPr>
+              <w:t>confirmed</w:t>
+            </w:r>
+            <w:r>
+              <w:rPr>
+                <w:sz w:val="17"/>
+              </w:rPr>
+              <w:t xml:space="preserve"> — the CLI exits 1, and </w:t>
+            </w:r>
+            <w:r>
+              <w:rPr>
+                <w:rFonts w:ascii="Consolas" w:hAnsi="Consolas"/>
+                <w:sz w:val="17"/>
+              </w:rPr>
+              <w:t>Algorithm(...)</w:t>
+            </w:r>
+            <w:r>
+              <w:rPr>
+                <w:sz w:val="17"/>
+              </w:rPr>
+              <w:t xml:space="preserve"> raises on the paradigm</w:t>
+            </w:r>
+          </w:p>
+        </w:tc>
+      </w:tr>
+      <w:tr>
+        <w:tc>
+          <w:tcPr>
+            <w:tcW w:type="dxa" w:w="4320"/>
+          </w:tcPr>
+          <w:p>
+            <w:pPr>
+              <w:spacing w:after="40"/>
+            </w:pPr>
+            <w:r>
+              <w:rPr>
+                <w:sz w:val="17"/>
+              </w:rPr>
+            </w:r>
+            <w:r>
+              <w:rPr>
+                <w:sz w:val="17"/>
+              </w:rPr>
+              <w:t xml:space="preserve">The shipped CI validator reports </w:t>
+            </w:r>
+            <w:r>
+              <w:rPr>
+                <w:b/>
+                <w:sz w:val="17"/>
+              </w:rPr>
+              <w:t>PASS</w:t>
+            </w:r>
+            <w:r>
+              <w:rPr>
+                <w:sz w:val="17"/>
+              </w:rPr>
+              <w:t xml:space="preserve"> for both</w:t>
+            </w:r>
+          </w:p>
+        </w:tc>
+        <w:tc>
+          <w:tcPr>
+            <w:tcW w:type="dxa" w:w="4320"/>
+          </w:tcPr>
+          <w:p>
+            <w:pPr>
+              <w:spacing w:after="40"/>
+            </w:pPr>
+            <w:r>
+              <w:rPr>
+                <w:sz w:val="17"/>
+              </w:rPr>
+            </w:r>
+            <w:r>
+              <w:rPr>
+                <w:b/>
+                <w:sz w:val="17"/>
+              </w:rPr>
+              <w:t>confirmed</w:t>
+            </w:r>
+          </w:p>
+        </w:tc>
+      </w:tr>
+      <w:tr>
+        <w:tc>
+          <w:tcPr>
+            <w:tcW w:type="dxa" w:w="4320"/>
+          </w:tcPr>
+          <w:p>
+            <w:pPr>
+              <w:spacing w:after="40"/>
+            </w:pPr>
+            <w:r>
+              <w:rPr>
+                <w:sz w:val="17"/>
+              </w:rPr>
+            </w:r>
+            <w:r>
+              <w:rPr>
+                <w:sz w:val="17"/>
+              </w:rPr>
+              <w:t xml:space="preserve">Core validates </w:t>
+            </w:r>
+            <w:r>
+              <w:rPr>
+                <w:rFonts w:ascii="Consolas" w:hAnsi="Consolas"/>
+                <w:sz w:val="17"/>
+              </w:rPr>
+              <w:t>paradigm_type</w:t>
+            </w:r>
+            <w:r>
+              <w:rPr>
+                <w:sz w:val="17"/>
+              </w:rPr>
+              <w:t xml:space="preserve"> silently / returns </w:t>
+            </w:r>
+            <w:r>
+              <w:rPr>
+                <w:rFonts w:ascii="Consolas" w:hAnsi="Consolas"/>
+                <w:sz w:val="17"/>
+              </w:rPr>
+              <w:t>None</w:t>
+            </w:r>
+          </w:p>
+        </w:tc>
+        <w:tc>
+          <w:tcPr>
+            <w:tcW w:type="dxa" w:w="4320"/>
+          </w:tcPr>
+          <w:p>
+            <w:pPr>
+              <w:spacing w:after="40"/>
+            </w:pPr>
+            <w:r>
+              <w:rPr>
+                <w:sz w:val="17"/>
+              </w:rPr>
+            </w:r>
+            <w:r>
+              <w:rPr>
+                <w:b/>
+                <w:sz w:val="17"/>
+              </w:rPr>
+              <w:t>RETRACTED — Core validates it correctly and loudly</w:t>
+            </w:r>
+          </w:p>
+        </w:tc>
+      </w:tr>
+    </w:tbl>
+    <w:p/>
+    <w:p>
+      <w:r>
+        <w:t>The run also shows the Examples fail *even earlier* than the paradigm check, at dataset</w:t>
+      </w:r>
+    </w:p>
+    <w:p>
+      <w:r>
+        <w:t>preparation (</w:t>
+      </w:r>
+      <w:r>
+        <w:rPr>
+          <w:rFonts w:ascii="Consolas" w:hAnsi="Consolas"/>
+          <w:sz w:val="18"/>
+        </w:rPr>
+        <w:t>not one of train_index/train_data/train_data_info</w:t>
+      </w:r>
+      <w:r>
+        <w:t>), so they are broken in at</w:t>
+      </w:r>
+    </w:p>
+    <w:p>
+      <w:r>
+        <w:t>least two independent ways.</w:t>
+      </w:r>
+    </w:p>
+    <w:p>
+      <w:r>
+        <w:rPr>
+          <w:b/>
+        </w:rPr>
+        <w:t>What the finding actually is, now that it is measured.</w:t>
+      </w:r>
+      <w:r>
+        <w:t xml:space="preserve"> The gap is not that Ianvs fails</w:t>
+      </w:r>
+    </w:p>
+    <w:p>
+      <w:r>
+        <w:t>to validate identifiers — Core validates them, with a good error message that even lists</w:t>
+      </w:r>
+    </w:p>
+    <w:p>
+      <w:r>
+        <w:t>the valid values. The gap is that **CI and Core validate different things, and CI's set is</w:t>
+      </w:r>
+    </w:p>
+    <w:p>
+      <w:r>
+        <w:t xml:space="preserve">the smaller one.** </w:t>
+      </w:r>
+      <w:r>
+        <w:rPr>
+          <w:rFonts w:ascii="Consolas" w:hAnsi="Consolas"/>
+          <w:sz w:val="18"/>
+        </w:rPr>
+        <w:t>ParadigmType</w:t>
+      </w:r>
+      <w:r>
+        <w:t xml:space="preserve"> is right there in </w:t>
+      </w:r>
+      <w:r>
+        <w:rPr>
+          <w:rFonts w:ascii="Consolas" w:hAnsi="Consolas"/>
+          <w:sz w:val="18"/>
+        </w:rPr>
+        <w:t>core/common/constant.py</w:t>
+      </w:r>
+      <w:r>
+        <w:t>; the</w:t>
+      </w:r>
+    </w:p>
+    <w:p>
+      <w:r>
+        <w:t xml:space="preserve">validator under </w:t>
+      </w:r>
+      <w:r>
+        <w:rPr>
+          <w:rFonts w:ascii="Consolas" w:hAnsi="Consolas"/>
+          <w:sz w:val="18"/>
+        </w:rPr>
+        <w:t>.github/workflows/validator/</w:t>
+      </w:r>
+      <w:r>
+        <w:t xml:space="preserve"> never consults it, so two Examples pass</w:t>
+      </w:r>
+    </w:p>
+    <w:p>
+      <w:r>
+        <w:t>every check the project runs and fail immediately when actually executed.</w:t>
+      </w:r>
+    </w:p>
+    <w:p>
+      <w:r>
+        <w:t>That is a narrower claim than the one I published, and it is a better one: it names the</w:t>
+      </w:r>
+    </w:p>
+    <w:p>
+      <w:r>
+        <w:t>information that already exists in the tree and is simply not wired into the check. It is</w:t>
+      </w:r>
+    </w:p>
+    <w:p>
+      <w:r>
+        <w:t>also exactly Step 1 of my Task 3 repair strategy — have Core expose what it would resolve,</w:t>
+      </w:r>
+    </w:p>
+    <w:p>
+      <w:r>
+        <w:t>so the existing validator can consult it — which I can now say is a small change rather</w:t>
+      </w:r>
+    </w:p>
+    <w:p>
+      <w:r>
+        <w:t>than a new subsystem.</w:t>
+      </w:r>
+    </w:p>
+    <w:p>
+      <w:r>
+        <w:rPr>
+          <w:b/>
+        </w:rPr>
+        <w:t>On my own method, again.</w:t>
+      </w:r>
+      <w:r>
+        <w:t xml:space="preserve"> This is my second correction on this submission. Both came</w:t>
+      </w:r>
+    </w:p>
+    <w:p>
+      <w:r>
+        <w:t>from the same habit: reading a dispatch chain and inferring behaviour instead of running</w:t>
+      </w:r>
+    </w:p>
+    <w:p>
+      <w:r>
+        <w:t>it. The first correction I found by reading someone else's review; this one I found by</w:t>
+      </w:r>
+    </w:p>
+    <w:p>
+      <w:r>
+        <w:t>finally installing the framework. The submission's own thesis is that unvalidated</w:t>
+      </w:r>
+    </w:p>
+    <w:p>
+      <w:r>
+        <w:t>declarations drift until something executes them — which turns out to apply to my</w:t>
+      </w:r>
+    </w:p>
+    <w:p>
+      <w:r>
+        <w:t>analysis as well as to the repository's configs.</w:t>
       </w:r>
     </w:p>
     <w:p>
@@ -26344,29 +27674,120 @@
         <w:t>ParadigmType</w:t>
       </w:r>
       <w:r>
-        <w:t xml:space="preserve">, and dispatch in </w:t>
-      </w:r>
-      <w:r>
-        <w:rPr>
-          <w:rFonts w:ascii="Consolas" w:hAnsi="Consolas"/>
-          <w:sz w:val="18"/>
-        </w:rPr>
-        <w:t>base.py:95-152</w:t>
-      </w:r>
-    </w:p>
-    <w:p>
-      <w:r>
-        <w:t xml:space="preserve">and </w:t>
-      </w:r>
-      <w:r>
-        <w:rPr>
-          <w:rFonts w:ascii="Consolas" w:hAnsi="Consolas"/>
-          <w:sz w:val="18"/>
-        </w:rPr>
-        <w:t>algorithm.py:109-127</w:t>
-      </w:r>
-      <w:r>
-        <w:t xml:space="preserve"> has no </w:t>
+        <w:t xml:space="preserve">, and Core raises </w:t>
+      </w:r>
+      <w:r>
+        <w:rPr>
+          <w:rFonts w:ascii="Consolas" w:hAnsi="Consolas"/>
+          <w:sz w:val="18"/>
+        </w:rPr>
+        <w:t>ValueError: not support paradigm(...)</w:t>
+      </w:r>
+      <w:r>
+        <w:t xml:space="preserve"> when it reaches them; see the second correction below.</w:t>
+      </w:r>
+    </w:p>
+    <w:p>
+      <w:r>
+        <w:t xml:space="preserve">The validator has zero references to </w:t>
+      </w:r>
+      <w:r>
+        <w:rPr>
+          <w:rFonts w:ascii="Consolas" w:hAnsi="Consolas"/>
+          <w:sz w:val="18"/>
+        </w:rPr>
+        <w:t>ClassFactory</w:t>
+      </w:r>
+      <w:r>
+        <w:t xml:space="preserve">, </w:t>
+      </w:r>
+      <w:r>
+        <w:rPr>
+          <w:rFonts w:ascii="Consolas" w:hAnsi="Consolas"/>
+          <w:sz w:val="18"/>
+        </w:rPr>
+        <w:t>register</w:t>
+      </w:r>
+      <w:r>
+        <w:t xml:space="preserve">, </w:t>
+      </w:r>
+      <w:r>
+        <w:rPr>
+          <w:rFonts w:ascii="Consolas" w:hAnsi="Consolas"/>
+          <w:sz w:val="18"/>
+        </w:rPr>
+        <w:t>alias</w:t>
+      </w:r>
+      <w:r>
+        <w:t xml:space="preserve"> or</w:t>
+      </w:r>
+    </w:p>
+    <w:p>
+      <w:r>
+        <w:rPr>
+          <w:rFonts w:ascii="Consolas" w:hAnsi="Consolas"/>
+          <w:sz w:val="18"/>
+        </w:rPr>
+        <w:t>paradigm_type</w:t>
+      </w:r>
+      <w:r>
+        <w:t>. It resolves paths, not identifiers. That is the precise shape of the gap,</w:t>
+      </w:r>
+    </w:p>
+    <w:p>
+      <w:r>
+        <w:t>and it is why #617's deletion should be described as retiring two Examples rather than as</w:t>
+      </w:r>
+    </w:p>
+    <w:p>
+      <w:r>
+        <w:t>removing unused files — nothing in CI will ever report their absence.</w:t>
+      </w:r>
+    </w:p>
+    <w:p>
+      <w:r>
+        <w:t>*(This update also corrects a claim in my Task 3 and Task 4 comments, where I wrote that no</w:t>
+      </w:r>
+    </w:p>
+    <w:p>
+      <w:r>
+        <w:t>static config validation existed. It does, it is merged, and it works for paths. See the</w:t>
+      </w:r>
+    </w:p>
+    <w:p>
+      <w:r>
+        <w:t>Correction sections there.)*</w:t>
+      </w:r>
+    </w:p>
+    <w:p>
+      <w:pPr>
+        <w:jc w:val="center"/>
+      </w:pPr>
+      <w:r>
+        <w:t>______________________________________________________________________________</w:t>
+      </w:r>
+    </w:p>
+    <w:p>
+      <w:pPr>
+        <w:pStyle w:val="Heading2"/>
+      </w:pPr>
+      <w:r>
+        <w:t>Second correction — posted 2026-08-28, after installing Ianvs and running it</w:t>
+      </w:r>
+    </w:p>
+    <w:p>
+      <w:r>
+        <w:t>**I got the mechanism wrong in the update above, and I am fixing it with an executed run</w:t>
+      </w:r>
+    </w:p>
+    <w:p>
+      <w:r>
+        <w:t>rather than another static reading.**</w:t>
+      </w:r>
+    </w:p>
+    <w:p>
+      <w:r>
+        <w:t xml:space="preserve">I wrote that dispatch "has no </w:t>
       </w:r>
       <w:r>
         <w:rPr>
@@ -26386,79 +27807,565 @@
         <w:t>None</w:t>
       </w:r>
       <w:r>
+        <w:t xml:space="preserve"> — no exception, no log</w:t>
+      </w:r>
+    </w:p>
+    <w:p>
+      <w:r>
+        <w:t xml:space="preserve">line, no validation at config-parse time." </w:t>
+      </w:r>
+      <w:r>
+        <w:rPr>
+          <w:b/>
+        </w:rPr>
+        <w:t>That is false.</w:t>
+      </w:r>
+    </w:p>
+    <w:p>
+      <w:r>
+        <w:rPr>
+          <w:rFonts w:ascii="Consolas" w:hAnsi="Consolas"/>
+          <w:sz w:val="18"/>
+        </w:rPr>
+        <w:t>core/testcasecontroller/algorithm/algorithm.py:140-143</w:t>
+      </w:r>
+      <w:r>
+        <w:t xml:space="preserve"> validates </w:t>
+      </w:r>
+      <w:r>
+        <w:rPr>
+          <w:rFonts w:ascii="Consolas" w:hAnsi="Consolas"/>
+          <w:sz w:val="18"/>
+        </w:rPr>
+        <w:t>paradigm_type</w:t>
+      </w:r>
+      <w:r>
+        <w:t xml:space="preserve"> against</w:t>
+      </w:r>
+    </w:p>
+    <w:p>
+      <w:r>
+        <w:t xml:space="preserve">the enum and raises. It is called from </w:t>
+      </w:r>
+      <w:r>
+        <w:rPr>
+          <w:rFonts w:ascii="Consolas" w:hAnsi="Consolas"/>
+          <w:sz w:val="18"/>
+        </w:rPr>
+        <w:t>_parse_config</w:t>
+      </w:r>
+      <w:r>
+        <w:t xml:space="preserve"> at line 167, long before the</w:t>
+      </w:r>
+    </w:p>
+    <w:p>
+      <w:r>
+        <w:t>dispatch chain I was reading is reached.</w:t>
+      </w:r>
+    </w:p>
+    <w:p>
+      <w:r>
+        <w:t>Installed Ianvs (</w:t>
+      </w:r>
+      <w:r>
+        <w:rPr>
+          <w:rFonts w:ascii="Consolas" w:hAnsi="Consolas"/>
+          <w:sz w:val="18"/>
+        </w:rPr>
+        <w:t>pip install -r requirements.txt</w:t>
+      </w:r>
+      <w:r>
+        <w:t xml:space="preserve"> plus the bundled</w:t>
+      </w:r>
+    </w:p>
+    <w:p>
+      <w:r>
+        <w:rPr>
+          <w:rFonts w:ascii="Consolas" w:hAnsi="Consolas"/>
+          <w:sz w:val="18"/>
+        </w:rPr>
+        <w:t>sedna-0.6.0.1</w:t>
+      </w:r>
+      <w:r>
+        <w:t xml:space="preserve"> wheel) and ran it:</w:t>
+      </w:r>
+    </w:p>
+    <w:p>
+      <w:pPr>
+        <w:spacing w:after="160"/>
+        <w:ind w:left="360"/>
+      </w:pPr>
+      <w:r>
+        <w:rPr>
+          <w:rFonts w:ascii="Consolas" w:hAnsi="Consolas"/>
+          <w:color w:val="223344"/>
+          <w:sz w:val="17"/>
+        </w:rPr>
+        <w:t>ianvs commit under test: 37a9c60</w:t>
+        <w:br/>
+        <w:br/>
+        <w:t>1. ianvs CLI on examples/yaoba/singletask_learning_boost</w:t>
+        <w:br/>
+        <w:t xml:space="preserve">   exit code: 1</w:t>
+        <w:br/>
+        <w:t xml:space="preserve">   RuntimeError: benchmarkingjob runs failed, error: prepare dataset failed,</w:t>
+        <w:br/>
+        <w:t xml:space="preserve">   error: not one of train_index/train_data/train_data_info..</w:t>
+        <w:br/>
+        <w:br/>
+        <w:t>2. Algorithm(...) -- where paradigm_type is validated</w:t>
+        <w:br/>
+        <w:t xml:space="preserve">   yaoba acboost: paradigm_type='singletasklearning_acboost'</w:t>
+        <w:br/>
+        <w:t xml:space="preserve">      -&gt; ValueError: not support paradigm(singletasklearning_acboost).</w:t>
+        <w:br/>
+        <w:t xml:space="preserve">         the following paradigms can be selected: ['singletasklearning', ...]</w:t>
+        <w:br/>
+        <w:t xml:space="preserve">   yaoba tta:     paradigm_type='singletasklearning_tta'</w:t>
+        <w:br/>
+        <w:t xml:space="preserve">      -&gt; ValueError: not support paradigm(singletasklearning_tta). ...</w:t>
+        <w:br/>
+        <w:t xml:space="preserve">   valid control: paradigm_type='singletasklearning'</w:t>
+        <w:br/>
+        <w:t xml:space="preserve">      -&gt; constructed, no error</w:t>
+      </w:r>
+    </w:p>
+    <w:p>
+      <w:r>
+        <w:t xml:space="preserve">Reproduce: </w:t>
+      </w:r>
+      <w:r>
+        <w:rPr>
+          <w:rFonts w:ascii="Consolas" w:hAnsi="Consolas"/>
+          <w:sz w:val="18"/>
+        </w:rPr>
+        <w:t>python3 tools/probe_paradigm_runtime.py ianvs</w:t>
+      </w:r>
+      <w:r>
         <w:t>.</w:t>
       </w:r>
     </w:p>
     <w:p>
       <w:r>
-        <w:t xml:space="preserve">The validator has zero references to </w:t>
-      </w:r>
-      <w:r>
-        <w:rPr>
-          <w:rFonts w:ascii="Consolas" w:hAnsi="Consolas"/>
-          <w:sz w:val="18"/>
-        </w:rPr>
-        <w:t>ClassFactory</w:t>
-      </w:r>
-      <w:r>
-        <w:t xml:space="preserve">, </w:t>
-      </w:r>
-      <w:r>
-        <w:rPr>
-          <w:rFonts w:ascii="Consolas" w:hAnsi="Consolas"/>
-          <w:sz w:val="18"/>
-        </w:rPr>
-        <w:t>register</w:t>
-      </w:r>
-      <w:r>
-        <w:t xml:space="preserve">, </w:t>
-      </w:r>
-      <w:r>
-        <w:rPr>
-          <w:rFonts w:ascii="Consolas" w:hAnsi="Consolas"/>
-          <w:sz w:val="18"/>
-        </w:rPr>
-        <w:t>alias</w:t>
-      </w:r>
-      <w:r>
-        <w:t xml:space="preserve"> or</w:t>
-      </w:r>
-    </w:p>
-    <w:p>
-      <w:r>
-        <w:rPr>
-          <w:rFonts w:ascii="Consolas" w:hAnsi="Consolas"/>
-          <w:sz w:val="18"/>
-        </w:rPr>
-        <w:t>paradigm_type</w:t>
-      </w:r>
-      <w:r>
-        <w:t>. It resolves paths, not identifiers. That is the precise shape of the gap,</w:t>
-      </w:r>
-    </w:p>
-    <w:p>
-      <w:r>
-        <w:t>and it is why #617's deletion should be described as retiring two Examples rather than as</w:t>
-      </w:r>
-    </w:p>
-    <w:p>
-      <w:r>
-        <w:t>removing unused files — nothing in CI will ever report their absence.</w:t>
-      </w:r>
-    </w:p>
-    <w:p>
-      <w:r>
-        <w:t>*(This update also corrects a claim in my Task 3 and Task 4 comments, where I wrote that no</w:t>
-      </w:r>
-    </w:p>
-    <w:p>
-      <w:r>
-        <w:t>static config validation existed. It does, it is merged, and it works for paths. See the</w:t>
-      </w:r>
-    </w:p>
-    <w:p>
-      <w:r>
-        <w:t>Correction sections there.)*</w:t>
+        <w:rPr>
+          <w:b/>
+        </w:rPr>
+        <w:t>Corrected statement of the finding.</w:t>
+      </w:r>
+      <w:r>
+        <w:t xml:space="preserve"> Two things I claimed are confirmed, one is retracted:</w:t>
+      </w:r>
+    </w:p>
+    <w:tbl>
+      <w:tblPr>
+        <w:tblStyle w:val="LightGrid-Accent1"/>
+        <w:tblW w:type="auto" w:w="0"/>
+        <w:tblLook w:firstColumn="1" w:firstRow="1" w:lastColumn="0" w:lastRow="0" w:noHBand="0" w:noVBand="1" w:val="04A0"/>
+      </w:tblPr>
+      <w:tblGrid>
+        <w:gridCol w:w="4320"/>
+        <w:gridCol w:w="4320"/>
+      </w:tblGrid>
+      <w:tr>
+        <w:tc>
+          <w:tcPr>
+            <w:tcW w:type="dxa" w:w="4320"/>
+          </w:tcPr>
+          <w:p>
+            <w:pPr>
+              <w:spacing w:after="40"/>
+            </w:pPr>
+            <w:r>
+              <w:rPr>
+                <w:b/>
+                <w:sz w:val="17"/>
+              </w:rPr>
+            </w:r>
+            <w:r>
+              <w:rPr>
+                <w:b/>
+                <w:sz w:val="17"/>
+              </w:rPr>
+              <w:t>Claim</w:t>
+            </w:r>
+          </w:p>
+        </w:tc>
+        <w:tc>
+          <w:tcPr>
+            <w:tcW w:type="dxa" w:w="4320"/>
+          </w:tcPr>
+          <w:p>
+            <w:pPr>
+              <w:spacing w:after="40"/>
+            </w:pPr>
+            <w:r>
+              <w:rPr>
+                <w:b/>
+                <w:sz w:val="17"/>
+              </w:rPr>
+            </w:r>
+            <w:r>
+              <w:rPr>
+                <w:b/>
+                <w:sz w:val="17"/>
+              </w:rPr>
+              <w:t>Verdict</w:t>
+            </w:r>
+          </w:p>
+        </w:tc>
+      </w:tr>
+      <w:tr>
+        <w:tc>
+          <w:tcPr>
+            <w:tcW w:type="dxa" w:w="4320"/>
+          </w:tcPr>
+          <w:p>
+            <w:pPr>
+              <w:spacing w:after="40"/>
+            </w:pPr>
+            <w:r>
+              <w:rPr>
+                <w:sz w:val="17"/>
+              </w:rPr>
+            </w:r>
+            <w:r>
+              <w:rPr>
+                <w:sz w:val="17"/>
+              </w:rPr>
+              <w:t xml:space="preserve">Both </w:t>
+            </w:r>
+            <w:r>
+              <w:rPr>
+                <w:rFonts w:ascii="Consolas" w:hAnsi="Consolas"/>
+                <w:sz w:val="17"/>
+              </w:rPr>
+              <w:t>yaoba</w:t>
+            </w:r>
+            <w:r>
+              <w:rPr>
+                <w:sz w:val="17"/>
+              </w:rPr>
+              <w:t xml:space="preserve"> Examples are unrunnable</w:t>
+            </w:r>
+          </w:p>
+        </w:tc>
+        <w:tc>
+          <w:tcPr>
+            <w:tcW w:type="dxa" w:w="4320"/>
+          </w:tcPr>
+          <w:p>
+            <w:pPr>
+              <w:spacing w:after="40"/>
+            </w:pPr>
+            <w:r>
+              <w:rPr>
+                <w:sz w:val="17"/>
+              </w:rPr>
+            </w:r>
+            <w:r>
+              <w:rPr>
+                <w:b/>
+                <w:sz w:val="17"/>
+              </w:rPr>
+              <w:t>confirmed</w:t>
+            </w:r>
+            <w:r>
+              <w:rPr>
+                <w:sz w:val="17"/>
+              </w:rPr>
+              <w:t xml:space="preserve"> — the CLI exits 1, and </w:t>
+            </w:r>
+            <w:r>
+              <w:rPr>
+                <w:rFonts w:ascii="Consolas" w:hAnsi="Consolas"/>
+                <w:sz w:val="17"/>
+              </w:rPr>
+              <w:t>Algorithm(...)</w:t>
+            </w:r>
+            <w:r>
+              <w:rPr>
+                <w:sz w:val="17"/>
+              </w:rPr>
+              <w:t xml:space="preserve"> raises on the paradigm</w:t>
+            </w:r>
+          </w:p>
+        </w:tc>
+      </w:tr>
+      <w:tr>
+        <w:tc>
+          <w:tcPr>
+            <w:tcW w:type="dxa" w:w="4320"/>
+          </w:tcPr>
+          <w:p>
+            <w:pPr>
+              <w:spacing w:after="40"/>
+            </w:pPr>
+            <w:r>
+              <w:rPr>
+                <w:sz w:val="17"/>
+              </w:rPr>
+            </w:r>
+            <w:r>
+              <w:rPr>
+                <w:sz w:val="17"/>
+              </w:rPr>
+              <w:t xml:space="preserve">The shipped CI validator reports </w:t>
+            </w:r>
+            <w:r>
+              <w:rPr>
+                <w:b/>
+                <w:sz w:val="17"/>
+              </w:rPr>
+              <w:t>PASS</w:t>
+            </w:r>
+            <w:r>
+              <w:rPr>
+                <w:sz w:val="17"/>
+              </w:rPr>
+              <w:t xml:space="preserve"> for both</w:t>
+            </w:r>
+          </w:p>
+        </w:tc>
+        <w:tc>
+          <w:tcPr>
+            <w:tcW w:type="dxa" w:w="4320"/>
+          </w:tcPr>
+          <w:p>
+            <w:pPr>
+              <w:spacing w:after="40"/>
+            </w:pPr>
+            <w:r>
+              <w:rPr>
+                <w:sz w:val="17"/>
+              </w:rPr>
+            </w:r>
+            <w:r>
+              <w:rPr>
+                <w:b/>
+                <w:sz w:val="17"/>
+              </w:rPr>
+              <w:t>confirmed</w:t>
+            </w:r>
+          </w:p>
+        </w:tc>
+      </w:tr>
+      <w:tr>
+        <w:tc>
+          <w:tcPr>
+            <w:tcW w:type="dxa" w:w="4320"/>
+          </w:tcPr>
+          <w:p>
+            <w:pPr>
+              <w:spacing w:after="40"/>
+            </w:pPr>
+            <w:r>
+              <w:rPr>
+                <w:sz w:val="17"/>
+              </w:rPr>
+            </w:r>
+            <w:r>
+              <w:rPr>
+                <w:sz w:val="17"/>
+              </w:rPr>
+              <w:t xml:space="preserve">Core validates </w:t>
+            </w:r>
+            <w:r>
+              <w:rPr>
+                <w:rFonts w:ascii="Consolas" w:hAnsi="Consolas"/>
+                <w:sz w:val="17"/>
+              </w:rPr>
+              <w:t>paradigm_type</w:t>
+            </w:r>
+            <w:r>
+              <w:rPr>
+                <w:sz w:val="17"/>
+              </w:rPr>
+              <w:t xml:space="preserve"> silently / returns </w:t>
+            </w:r>
+            <w:r>
+              <w:rPr>
+                <w:rFonts w:ascii="Consolas" w:hAnsi="Consolas"/>
+                <w:sz w:val="17"/>
+              </w:rPr>
+              <w:t>None</w:t>
+            </w:r>
+          </w:p>
+        </w:tc>
+        <w:tc>
+          <w:tcPr>
+            <w:tcW w:type="dxa" w:w="4320"/>
+          </w:tcPr>
+          <w:p>
+            <w:pPr>
+              <w:spacing w:after="40"/>
+            </w:pPr>
+            <w:r>
+              <w:rPr>
+                <w:sz w:val="17"/>
+              </w:rPr>
+            </w:r>
+            <w:r>
+              <w:rPr>
+                <w:b/>
+                <w:sz w:val="17"/>
+              </w:rPr>
+              <w:t>RETRACTED — Core validates it correctly and loudly</w:t>
+            </w:r>
+          </w:p>
+        </w:tc>
+      </w:tr>
+    </w:tbl>
+    <w:p/>
+    <w:p>
+      <w:r>
+        <w:t>The run also shows the Examples fail *even earlier* than the paradigm check, at dataset</w:t>
+      </w:r>
+    </w:p>
+    <w:p>
+      <w:r>
+        <w:t>preparation (</w:t>
+      </w:r>
+      <w:r>
+        <w:rPr>
+          <w:rFonts w:ascii="Consolas" w:hAnsi="Consolas"/>
+          <w:sz w:val="18"/>
+        </w:rPr>
+        <w:t>not one of train_index/train_data/train_data_info</w:t>
+      </w:r>
+      <w:r>
+        <w:t>), so they are broken in at</w:t>
+      </w:r>
+    </w:p>
+    <w:p>
+      <w:r>
+        <w:t>least two independent ways.</w:t>
+      </w:r>
+    </w:p>
+    <w:p>
+      <w:r>
+        <w:rPr>
+          <w:b/>
+        </w:rPr>
+        <w:t>What the finding actually is, now that it is measured.</w:t>
+      </w:r>
+      <w:r>
+        <w:t xml:space="preserve"> The gap is not that Ianvs fails</w:t>
+      </w:r>
+    </w:p>
+    <w:p>
+      <w:r>
+        <w:t>to validate identifiers — Core validates them, with a good error message that even lists</w:t>
+      </w:r>
+    </w:p>
+    <w:p>
+      <w:r>
+        <w:t>the valid values. The gap is that **CI and Core validate different things, and CI's set is</w:t>
+      </w:r>
+    </w:p>
+    <w:p>
+      <w:r>
+        <w:t xml:space="preserve">the smaller one.** </w:t>
+      </w:r>
+      <w:r>
+        <w:rPr>
+          <w:rFonts w:ascii="Consolas" w:hAnsi="Consolas"/>
+          <w:sz w:val="18"/>
+        </w:rPr>
+        <w:t>ParadigmType</w:t>
+      </w:r>
+      <w:r>
+        <w:t xml:space="preserve"> is right there in </w:t>
+      </w:r>
+      <w:r>
+        <w:rPr>
+          <w:rFonts w:ascii="Consolas" w:hAnsi="Consolas"/>
+          <w:sz w:val="18"/>
+        </w:rPr>
+        <w:t>core/common/constant.py</w:t>
+      </w:r>
+      <w:r>
+        <w:t>; the</w:t>
+      </w:r>
+    </w:p>
+    <w:p>
+      <w:r>
+        <w:t xml:space="preserve">validator under </w:t>
+      </w:r>
+      <w:r>
+        <w:rPr>
+          <w:rFonts w:ascii="Consolas" w:hAnsi="Consolas"/>
+          <w:sz w:val="18"/>
+        </w:rPr>
+        <w:t>.github/workflows/validator/</w:t>
+      </w:r>
+      <w:r>
+        <w:t xml:space="preserve"> never consults it, so two Examples pass</w:t>
+      </w:r>
+    </w:p>
+    <w:p>
+      <w:r>
+        <w:t>every check the project runs and fail immediately when actually executed.</w:t>
+      </w:r>
+    </w:p>
+    <w:p>
+      <w:r>
+        <w:t>That is a narrower claim than the one I published, and it is a better one: it names the</w:t>
+      </w:r>
+    </w:p>
+    <w:p>
+      <w:r>
+        <w:t>information that already exists in the tree and is simply not wired into the check. It is</w:t>
+      </w:r>
+    </w:p>
+    <w:p>
+      <w:r>
+        <w:t>also exactly Step 1 of my Task 3 repair strategy — have Core expose what it would resolve,</w:t>
+      </w:r>
+    </w:p>
+    <w:p>
+      <w:r>
+        <w:t>so the existing validator can consult it — which I can now say is a small change rather</w:t>
+      </w:r>
+    </w:p>
+    <w:p>
+      <w:r>
+        <w:t>than a new subsystem.</w:t>
+      </w:r>
+    </w:p>
+    <w:p>
+      <w:r>
+        <w:rPr>
+          <w:b/>
+        </w:rPr>
+        <w:t>On my own method, again.</w:t>
+      </w:r>
+      <w:r>
+        <w:t xml:space="preserve"> This is my second correction on this submission. Both came</w:t>
+      </w:r>
+    </w:p>
+    <w:p>
+      <w:r>
+        <w:t>from the same habit: reading a dispatch chain and inferring behaviour instead of running</w:t>
+      </w:r>
+    </w:p>
+    <w:p>
+      <w:r>
+        <w:t>it. The first correction I found by reading someone else's review; this one I found by</w:t>
+      </w:r>
+    </w:p>
+    <w:p>
+      <w:r>
+        <w:t>finally installing the framework. The submission's own thesis is that unvalidated</w:t>
+      </w:r>
+    </w:p>
+    <w:p>
+      <w:r>
+        <w:t>declarations drift until something executes them — which turns out to apply to my</w:t>
+      </w:r>
+    </w:p>
+    <w:p>
+      <w:r>
+        <w:t>analysis as well as to the repository's configs.</w:t>
       </w:r>
     </w:p>
     <w:p>
@@ -29738,6 +31645,568 @@
           <w:sz w:val="18"/>
         </w:rPr>
         <w:t>python3 tools/run_shipped_validator.py ianvs</w:t>
+      </w:r>
+      <w:r>
+        <w:t xml:space="preserve"> —</w:t>
+      </w:r>
+    </w:p>
+    <w:p>
+      <w:r>
+        <w:t>https://github.com/henryng15/ianvs-lfx-pretest</w:t>
+      </w:r>
+    </w:p>
+    <w:p>
+      <w:pPr>
+        <w:pStyle w:val="Heading2"/>
+      </w:pPr>
+      <w:r>
+        <w:t>PR #617 (correction)</w:t>
+      </w:r>
+    </w:p>
+    <w:p>
+      <w:r>
+        <w:t>https://github.com/kubeedge/ianvs/pull/617#pullrequestreview-5047393734</w:t>
+      </w:r>
+    </w:p>
+    <w:p>
+      <w:r>
+        <w:t>Correction to my own follow-up above, with an executed run this time.</w:t>
+      </w:r>
+    </w:p>
+    <w:p>
+      <w:r>
+        <w:t xml:space="preserve">I wrote that dispatch "is a chain of </w:t>
+      </w:r>
+      <w:r>
+        <w:rPr>
+          <w:rFonts w:ascii="Consolas" w:hAnsi="Consolas"/>
+          <w:sz w:val="18"/>
+        </w:rPr>
+        <w:t>if</w:t>
+      </w:r>
+      <w:r>
+        <w:t xml:space="preserve"> comparisons with no </w:t>
+      </w:r>
+      <w:r>
+        <w:rPr>
+          <w:rFonts w:ascii="Consolas" w:hAnsi="Consolas"/>
+          <w:sz w:val="18"/>
+        </w:rPr>
+        <w:t>else</w:t>
+      </w:r>
+      <w:r>
+        <w:t xml:space="preserve"> — so the call returns</w:t>
+      </w:r>
+    </w:p>
+    <w:p>
+      <w:r>
+        <w:rPr>
+          <w:rFonts w:ascii="Consolas" w:hAnsi="Consolas"/>
+          <w:sz w:val="18"/>
+        </w:rPr>
+        <w:t>None</w:t>
+      </w:r>
+      <w:r>
+        <w:t xml:space="preserve"> with no exception and no log line." </w:t>
+      </w:r>
+      <w:r>
+        <w:rPr>
+          <w:b/>
+        </w:rPr>
+        <w:t>That is wrong</w:t>
+      </w:r>
+      <w:r>
+        <w:t>, and I should not have</w:t>
+      </w:r>
+    </w:p>
+    <w:p>
+      <w:r>
+        <w:t>inferred it from reading the dispatch chain.</w:t>
+      </w:r>
+    </w:p>
+    <w:p>
+      <w:r>
+        <w:rPr>
+          <w:rFonts w:ascii="Consolas" w:hAnsi="Consolas"/>
+          <w:sz w:val="18"/>
+        </w:rPr>
+        <w:t>core/testcasecontroller/algorithm/algorithm.py:140-143</w:t>
+      </w:r>
+      <w:r>
+        <w:t xml:space="preserve"> validates </w:t>
+      </w:r>
+      <w:r>
+        <w:rPr>
+          <w:rFonts w:ascii="Consolas" w:hAnsi="Consolas"/>
+          <w:sz w:val="18"/>
+        </w:rPr>
+        <w:t>paradigm_type</w:t>
+      </w:r>
+      <w:r>
+        <w:t xml:space="preserve"> against</w:t>
+      </w:r>
+    </w:p>
+    <w:p>
+      <w:r>
+        <w:rPr>
+          <w:rFonts w:ascii="Consolas" w:hAnsi="Consolas"/>
+          <w:sz w:val="18"/>
+        </w:rPr>
+        <w:t>ParadigmType</w:t>
+      </w:r>
+      <w:r>
+        <w:t xml:space="preserve"> and raises; </w:t>
+      </w:r>
+      <w:r>
+        <w:rPr>
+          <w:rFonts w:ascii="Consolas" w:hAnsi="Consolas"/>
+          <w:sz w:val="18"/>
+        </w:rPr>
+        <w:t>_parse_config</w:t>
+      </w:r>
+      <w:r>
+        <w:t xml:space="preserve"> calls it at line 167, well before</w:t>
+      </w:r>
+    </w:p>
+    <w:p>
+      <w:r>
+        <w:rPr>
+          <w:rFonts w:ascii="Consolas" w:hAnsi="Consolas"/>
+          <w:sz w:val="18"/>
+        </w:rPr>
+        <w:t>build_paradigm_job</w:t>
+      </w:r>
+      <w:r>
+        <w:t xml:space="preserve"> is reached.</w:t>
+      </w:r>
+    </w:p>
+    <w:p>
+      <w:r>
+        <w:t>I installed Ianvs (</w:t>
+      </w:r>
+      <w:r>
+        <w:rPr>
+          <w:rFonts w:ascii="Consolas" w:hAnsi="Consolas"/>
+          <w:sz w:val="18"/>
+        </w:rPr>
+        <w:t>requirements.txt</w:t>
+      </w:r>
+      <w:r>
+        <w:t xml:space="preserve"> plus the bundled </w:t>
+      </w:r>
+      <w:r>
+        <w:rPr>
+          <w:rFonts w:ascii="Consolas" w:hAnsi="Consolas"/>
+          <w:sz w:val="18"/>
+        </w:rPr>
+        <w:t>sedna-0.6.0.1</w:t>
+      </w:r>
+      <w:r>
+        <w:t xml:space="preserve"> wheel) and ran it</w:t>
+      </w:r>
+    </w:p>
+    <w:p>
+      <w:r>
+        <w:t xml:space="preserve">at </w:t>
+      </w:r>
+      <w:r>
+        <w:rPr>
+          <w:rFonts w:ascii="Consolas" w:hAnsi="Consolas"/>
+          <w:sz w:val="18"/>
+        </w:rPr>
+        <w:t>37a9c60</w:t>
+      </w:r>
+      <w:r>
+        <w:t>:</w:t>
+      </w:r>
+    </w:p>
+    <w:p>
+      <w:pPr>
+        <w:spacing w:after="160"/>
+        <w:ind w:left="360"/>
+      </w:pPr>
+      <w:r>
+        <w:rPr>
+          <w:rFonts w:ascii="Consolas" w:hAnsi="Consolas"/>
+          <w:color w:val="223344"/>
+          <w:sz w:val="17"/>
+        </w:rPr>
+        <w:t>1. ianvs CLI on examples/yaoba/singletask_learning_boost</w:t>
+        <w:br/>
+        <w:t xml:space="preserve">   exit code: 1</w:t>
+        <w:br/>
+        <w:t xml:space="preserve">   RuntimeError: benchmarkingjob runs failed, error: prepare dataset failed,</w:t>
+        <w:br/>
+        <w:t xml:space="preserve">   error: not one of train_index/train_data/train_data_info..</w:t>
+        <w:br/>
+        <w:br/>
+        <w:t>2. Algorithm(...) -- where paradigm_type is validated</w:t>
+        <w:br/>
+        <w:t xml:space="preserve">   yaoba acboost: paradigm_type='singletasklearning_acboost'</w:t>
+        <w:br/>
+        <w:t xml:space="preserve">      -&gt; ValueError: not support paradigm(singletasklearning_acboost).</w:t>
+        <w:br/>
+        <w:t xml:space="preserve">         the following paradigms can be selected: ['singletasklearning', ...]</w:t>
+        <w:br/>
+        <w:t xml:space="preserve">   yaoba tta:     paradigm_type='singletasklearning_tta'</w:t>
+        <w:br/>
+        <w:t xml:space="preserve">      -&gt; ValueError: not support paradigm(singletasklearning_tta). ...</w:t>
+        <w:br/>
+        <w:t xml:space="preserve">   valid control: paradigm_type='singletasklearning'</w:t>
+        <w:br/>
+        <w:t xml:space="preserve">      -&gt; constructed, no error</w:t>
+      </w:r>
+    </w:p>
+    <w:p>
+      <w:r>
+        <w:rPr>
+          <w:b/>
+        </w:rPr>
+        <w:t>What holds and what I retract:</w:t>
+      </w:r>
+    </w:p>
+    <w:tbl>
+      <w:tblPr>
+        <w:tblStyle w:val="LightGrid-Accent1"/>
+        <w:tblW w:type="auto" w:w="0"/>
+        <w:tblLook w:firstColumn="1" w:firstRow="1" w:lastColumn="0" w:lastRow="0" w:noHBand="0" w:noVBand="1" w:val="04A0"/>
+      </w:tblPr>
+      <w:tblGrid>
+        <w:gridCol w:w="4320"/>
+        <w:gridCol w:w="4320"/>
+      </w:tblGrid>
+      <w:tr>
+        <w:tc>
+          <w:tcPr>
+            <w:tcW w:type="dxa" w:w="4320"/>
+          </w:tcPr>
+          <w:p>
+            <w:pPr>
+              <w:spacing w:after="40"/>
+            </w:pPr>
+            <w:r>
+              <w:rPr>
+                <w:b/>
+                <w:sz w:val="17"/>
+              </w:rPr>
+            </w:r>
+          </w:p>
+        </w:tc>
+        <w:tc>
+          <w:tcPr>
+            <w:tcW w:type="dxa" w:w="4320"/>
+          </w:tcPr>
+          <w:p>
+            <w:pPr>
+              <w:spacing w:after="40"/>
+            </w:pPr>
+            <w:r>
+              <w:rPr>
+                <w:b/>
+                <w:sz w:val="17"/>
+              </w:rPr>
+            </w:r>
+          </w:p>
+        </w:tc>
+      </w:tr>
+      <w:tr>
+        <w:tc>
+          <w:tcPr>
+            <w:tcW w:type="dxa" w:w="4320"/>
+          </w:tcPr>
+          <w:p>
+            <w:pPr>
+              <w:spacing w:after="40"/>
+            </w:pPr>
+            <w:r>
+              <w:rPr>
+                <w:sz w:val="17"/>
+              </w:rPr>
+            </w:r>
+            <w:r>
+              <w:rPr>
+                <w:sz w:val="17"/>
+              </w:rPr>
+              <w:t>Both Examples this PR retires are unrunnable</w:t>
+            </w:r>
+          </w:p>
+        </w:tc>
+        <w:tc>
+          <w:tcPr>
+            <w:tcW w:type="dxa" w:w="4320"/>
+          </w:tcPr>
+          <w:p>
+            <w:pPr>
+              <w:spacing w:after="40"/>
+            </w:pPr>
+            <w:r>
+              <w:rPr>
+                <w:sz w:val="17"/>
+              </w:rPr>
+            </w:r>
+            <w:r>
+              <w:rPr>
+                <w:b/>
+                <w:sz w:val="17"/>
+              </w:rPr>
+              <w:t>confirmed</w:t>
+            </w:r>
+            <w:r>
+              <w:rPr>
+                <w:sz w:val="17"/>
+              </w:rPr>
+              <w:t xml:space="preserve"> — CLI exits 1; </w:t>
+            </w:r>
+            <w:r>
+              <w:rPr>
+                <w:rFonts w:ascii="Consolas" w:hAnsi="Consolas"/>
+                <w:sz w:val="17"/>
+              </w:rPr>
+              <w:t>Algorithm(...)</w:t>
+            </w:r>
+            <w:r>
+              <w:rPr>
+                <w:sz w:val="17"/>
+              </w:rPr>
+              <w:t xml:space="preserve"> raises on the paradigm</w:t>
+            </w:r>
+          </w:p>
+        </w:tc>
+      </w:tr>
+      <w:tr>
+        <w:tc>
+          <w:tcPr>
+            <w:tcW w:type="dxa" w:w="4320"/>
+          </w:tcPr>
+          <w:p>
+            <w:pPr>
+              <w:spacing w:after="40"/>
+            </w:pPr>
+            <w:r>
+              <w:rPr>
+                <w:sz w:val="17"/>
+              </w:rPr>
+            </w:r>
+            <w:r>
+              <w:rPr>
+                <w:sz w:val="17"/>
+              </w:rPr>
+              <w:t xml:space="preserve">The shipped CI validator reports </w:t>
+            </w:r>
+            <w:r>
+              <w:rPr>
+                <w:b/>
+                <w:sz w:val="17"/>
+              </w:rPr>
+              <w:t>PASS</w:t>
+            </w:r>
+            <w:r>
+              <w:rPr>
+                <w:sz w:val="17"/>
+              </w:rPr>
+              <w:t xml:space="preserve"> for both</w:t>
+            </w:r>
+          </w:p>
+        </w:tc>
+        <w:tc>
+          <w:tcPr>
+            <w:tcW w:type="dxa" w:w="4320"/>
+          </w:tcPr>
+          <w:p>
+            <w:pPr>
+              <w:spacing w:after="40"/>
+            </w:pPr>
+            <w:r>
+              <w:rPr>
+                <w:sz w:val="17"/>
+              </w:rPr>
+            </w:r>
+            <w:r>
+              <w:rPr>
+                <w:b/>
+                <w:sz w:val="17"/>
+              </w:rPr>
+              <w:t>confirmed</w:t>
+            </w:r>
+          </w:p>
+        </w:tc>
+      </w:tr>
+      <w:tr>
+        <w:tc>
+          <w:tcPr>
+            <w:tcW w:type="dxa" w:w="4320"/>
+          </w:tcPr>
+          <w:p>
+            <w:pPr>
+              <w:spacing w:after="40"/>
+            </w:pPr>
+            <w:r>
+              <w:rPr>
+                <w:sz w:val="17"/>
+              </w:rPr>
+            </w:r>
+            <w:r>
+              <w:rPr>
+                <w:sz w:val="17"/>
+              </w:rPr>
+              <w:t xml:space="preserve">Core validates </w:t>
+            </w:r>
+            <w:r>
+              <w:rPr>
+                <w:rFonts w:ascii="Consolas" w:hAnsi="Consolas"/>
+                <w:sz w:val="17"/>
+              </w:rPr>
+              <w:t>paradigm_type</w:t>
+            </w:r>
+            <w:r>
+              <w:rPr>
+                <w:sz w:val="17"/>
+              </w:rPr>
+              <w:t xml:space="preserve"> silently / returns </w:t>
+            </w:r>
+            <w:r>
+              <w:rPr>
+                <w:rFonts w:ascii="Consolas" w:hAnsi="Consolas"/>
+                <w:sz w:val="17"/>
+              </w:rPr>
+              <w:t>None</w:t>
+            </w:r>
+          </w:p>
+        </w:tc>
+        <w:tc>
+          <w:tcPr>
+            <w:tcW w:type="dxa" w:w="4320"/>
+          </w:tcPr>
+          <w:p>
+            <w:pPr>
+              <w:spacing w:after="40"/>
+            </w:pPr>
+            <w:r>
+              <w:rPr>
+                <w:sz w:val="17"/>
+              </w:rPr>
+            </w:r>
+            <w:r>
+              <w:rPr>
+                <w:b/>
+                <w:sz w:val="17"/>
+              </w:rPr>
+              <w:t>retracted — Core validates it correctly, and the error message even lists the valid values</w:t>
+            </w:r>
+          </w:p>
+        </w:tc>
+      </w:tr>
+    </w:tbl>
+    <w:p/>
+    <w:p>
+      <w:r>
+        <w:t>The run also shows these Examples fail *earlier* than the paradigm check, at dataset</w:t>
+      </w:r>
+    </w:p>
+    <w:p>
+      <w:r>
+        <w:t>preparation, so they are broken in at least two independent ways.</w:t>
+      </w:r>
+    </w:p>
+    <w:p>
+      <w:r>
+        <w:rPr>
+          <w:b/>
+        </w:rPr>
+        <w:t>None of this changes my recommendation, which remains `accepted as it is`,</w:t>
+      </w:r>
+      <w:r>
+        <w:t xml:space="preserve"> and the one</w:t>
+      </w:r>
+    </w:p>
+    <w:p>
+      <w:r>
+        <w:t>request I made stands but for a better reason than I originally gave. It is not that</w:t>
+      </w:r>
+    </w:p>
+    <w:p>
+      <w:r>
+        <w:t>nothing would report these Examples as broken — Core reports them clearly the moment</w:t>
+      </w:r>
+    </w:p>
+    <w:p>
+      <w:r>
+        <w:t xml:space="preserve">anyone runs them. It is that </w:t>
+      </w:r>
+      <w:r>
+        <w:rPr>
+          <w:b/>
+        </w:rPr>
+        <w:t>CI does not</w:t>
+      </w:r>
+      <w:r>
+        <w:t>, because the validator never consults</w:t>
+      </w:r>
+    </w:p>
+    <w:p>
+      <w:r>
+        <w:rPr>
+          <w:rFonts w:ascii="Consolas" w:hAnsi="Consolas"/>
+          <w:sz w:val="18"/>
+        </w:rPr>
+        <w:t>ParadigmType</w:t>
+      </w:r>
+      <w:r>
+        <w:t xml:space="preserve"> even though it sits in </w:t>
+      </w:r>
+      <w:r>
+        <w:rPr>
+          <w:rFonts w:ascii="Consolas" w:hAnsi="Consolas"/>
+          <w:sz w:val="18"/>
+        </w:rPr>
+        <w:t>core/common/constant.py</w:t>
+      </w:r>
+      <w:r>
+        <w:t>. So deleting the two</w:t>
+      </w:r>
+    </w:p>
+    <w:p>
+      <w:r>
+        <w:t>paradigm implementations is correct, and a line in the description saying whether the</w:t>
+      </w:r>
+    </w:p>
+    <w:p>
+      <w:r>
+        <w:rPr>
+          <w:rFonts w:ascii="Consolas" w:hAnsi="Consolas"/>
+          <w:sz w:val="18"/>
+        </w:rPr>
+        <w:t>yaoba</w:t>
+      </w:r>
+      <w:r>
+        <w:t xml:space="preserve"> Examples are being retired deliberately would still help — CI will keep saying</w:t>
+      </w:r>
+    </w:p>
+    <w:p>
+      <w:r>
+        <w:t>they are fine either way.</w:t>
+      </w:r>
+    </w:p>
+    <w:p>
+      <w:r>
+        <w:t>Apologies for the noise of a third comment on this PR. I would rather correct a wrong</w:t>
+      </w:r>
+    </w:p>
+    <w:p>
+      <w:r>
+        <w:t>statement I made on your PR than leave it sitting there.</w:t>
+      </w:r>
+    </w:p>
+    <w:p>
+      <w:r>
+        <w:t xml:space="preserve">Reproduce: </w:t>
+      </w:r>
+      <w:r>
+        <w:rPr>
+          <w:rFonts w:ascii="Consolas" w:hAnsi="Consolas"/>
+          <w:sz w:val="18"/>
+        </w:rPr>
+        <w:t>python3 tools/probe_paradigm_runtime.py ianvs</w:t>
       </w:r>
       <w:r>
         <w:t xml:space="preserve"> —</w:t>

</xml_diff>